<commit_message>
Embed original diagrams (Q23, Q24, Q31, Q32) into Vietnamese exam files
Extract the state transition diagram, control flow graph, effort bar chart
and test-case dependency figure from the source PDF and embed them in the
Markdown, Word, and PDF versions, replacing the placeholder notes.

Co-Authored-By: Claude Opus 4.8 <noreply@anthropic.com>
Claude-Session: https://claude.ai/code/session_01B3XRbmPPW4Ph4Yps3m56ta
</commit_message>
<xml_diff>
--- a/ISTQB_CTFL_v4.0_De_Thi_Mau_C_Cau_Hoi_TiengViet.docx
+++ b/ISTQB_CTFL_v4.0_De_Thi_Mau_C_Cau_Hoi_TiengViet.docx
@@ -2628,6 +2628,952 @@
     </w:p>
     <w:p>
       <w:pPr>
+        <w:spacing w:after="40" w:before="80"/>
+        <w:jc w:val="center"/>
+      </w:pPr>
+      <w:r>
+        <w:drawing>
+          <wp:inline distT="0" distB="0" distL="0" distR="0">
+            <wp:extent cx="4381500" cy="2162175"/>
+            <wp:effectExtent t="0" r="0" b="0" l="0"/>
+            <wp:docPr id="1" name="" descr="" title=""/>
+            <wp:cNvGraphicFramePr>
+              <a:graphicFrameLocks xmlns:a="http://schemas.openxmlformats.org/drawingml/2006/main" noChangeAspect="1"/>
+            </wp:cNvGraphicFramePr>
+            <a:graphic xmlns:a="http://schemas.openxmlformats.org/drawingml/2006/main">
+              <a:graphicData uri="http://schemas.openxmlformats.org/drawingml/2006/picture">
+                <pic:pic xmlns:pic="http://schemas.openxmlformats.org/drawingml/2006/picture">
+                  <pic:nvPicPr>
+                    <pic:cNvPr id="0" name="" descr=""/>
+                    <pic:cNvPicPr>
+                      <a:picLocks noChangeAspect="1" noChangeArrowheads="1"/>
+                    </pic:cNvPicPr>
+                  </pic:nvPicPr>
+                  <pic:blipFill>
+                    <a:blip r:embed="rId7" cstate="none"/>
+                    <a:srcRect/>
+                    <a:stretch>
+                      <a:fillRect/>
+                    </a:stretch>
+                  </pic:blipFill>
+                  <pic:spPr bwMode="auto">
+                    <a:xfrm>
+                      <a:off x="0" y="0"/>
+                      <a:ext cx="4381500" cy="2162175"/>
+                    </a:xfrm>
+                    <a:prstGeom prst="rect">
+                      <a:avLst/>
+                    </a:prstGeom>
+                  </pic:spPr>
+                </pic:pic>
+              </a:graphicData>
+            </a:graphic>
+          </wp:inline>
+        </w:drawing>
+      </w:r>
+    </w:p>
+    <w:p>
+      <w:pPr>
+        <w:spacing w:after="120"/>
+        <w:jc w:val="center"/>
+      </w:pPr>
+      <w:r>
+        <w:rPr>
+          <w:i/>
+          <w:iCs/>
+          <w:color w:val="777777"/>
+          <w:sz w:val="18"/>
+          <w:szCs w:val="18"/>
+        </w:rPr>
+        <w:t xml:space="preserve">Sơ đồ chuyển trạng thái</w:t>
+      </w:r>
+    </w:p>
+    <w:p>
+      <w:pPr>
+        <w:spacing w:after="40"/>
+      </w:pPr>
+      <w:r>
+        <w:t xml:space="preserve">Số lượng ca kiểm thử TỐI THIỂU cần thiết để đạt được 100% độ bao phủ chuyển trạng thái hợp lệ (valid transitions coverage) là bao nhiêu?</w:t>
+      </w:r>
+    </w:p>
+    <w:p>
+      <w:pPr>
+        <w:spacing w:after="40"/>
+      </w:pPr>
+      <w:r>
+        <w:t xml:space="preserve">a) 3</w:t>
+      </w:r>
+    </w:p>
+    <w:p>
+      <w:pPr>
+        <w:spacing w:after="40"/>
+      </w:pPr>
+      <w:r>
+        <w:t xml:space="preserve">b) 2</w:t>
+      </w:r>
+    </w:p>
+    <w:p>
+      <w:pPr>
+        <w:spacing w:after="40"/>
+      </w:pPr>
+      <w:r>
+        <w:t xml:space="preserve">c) 5</w:t>
+      </w:r>
+    </w:p>
+    <w:p>
+      <w:pPr>
+        <w:spacing w:after="40"/>
+      </w:pPr>
+      <w:r>
+        <w:t xml:space="preserve">d) 6</w:t>
+      </w:r>
+    </w:p>
+    <w:p>
+      <w:pPr>
+        <w:spacing w:after="40"/>
+      </w:pPr>
+      <w:r>
+        <w:t xml:space="preserve">Chọn MỘT phương án.</w:t>
+      </w:r>
+    </w:p>
+    <w:p>
+      <w:pPr>
+        <w:pBdr>
+          <w:bottom w:val="single" w:color="AAAAAA" w:sz="6" w:space="1"/>
+        </w:pBdr>
+        <w:spacing w:after="120"/>
+      </w:pPr>
+    </w:p>
+    <w:p>
+      <w:pPr>
+        <w:spacing w:after="20"/>
+      </w:pPr>
+      <w:r>
+        <w:rPr>
+          <w:color w:val="888888"/>
+          <w:sz w:val="16"/>
+          <w:szCs w:val="16"/>
+        </w:rPr>
+        <w:t xml:space="preserve">Phiên bản 1.6 — Trang 15/21 — Ngày 25 tháng 3 năm 2025</w:t>
+      </w:r>
+    </w:p>
+    <w:p>
+      <w:pPr>
+        <w:spacing w:after="20"/>
+      </w:pPr>
+      <w:r>
+        <w:rPr>
+          <w:color w:val="888888"/>
+          <w:sz w:val="16"/>
+          <w:szCs w:val="16"/>
+        </w:rPr>
+        <w:t xml:space="preserve">© International Software Testing Qualifications Board</w:t>
+      </w:r>
+    </w:p>
+    <w:p>
+      <w:pPr>
+        <w:pStyle w:val="Heading2"/>
+        <w:spacing w:after="80" w:before="200"/>
+      </w:pPr>
+      <w:r>
+        <w:rPr>
+          <w:b/>
+          <w:bCs/>
+        </w:rPr>
+        <w:t xml:space="preserve">Câu #24 (1 Điểm)</w:t>
+      </w:r>
+    </w:p>
+    <w:p>
+      <w:pPr>
+        <w:spacing w:after="40"/>
+      </w:pPr>
+      <w:r>
+        <w:t xml:space="preserve">Bạn muốn áp dụng kiểm thử nhánh (branch testing) cho đoạn mã được biểu diễn bởi đồ thị luồng điều khiển (control flow graph) sau đây.</w:t>
+      </w:r>
+    </w:p>
+    <w:p>
+      <w:pPr>
+        <w:spacing w:after="40" w:before="80"/>
+        <w:jc w:val="center"/>
+      </w:pPr>
+      <w:r>
+        <w:drawing>
+          <wp:inline distT="0" distB="0" distL="0" distR="0">
+            <wp:extent cx="4381500" cy="5153025"/>
+            <wp:effectExtent t="0" r="0" b="0" l="0"/>
+            <wp:docPr id="1" name="" descr="" title=""/>
+            <wp:cNvGraphicFramePr>
+              <a:graphicFrameLocks xmlns:a="http://schemas.openxmlformats.org/drawingml/2006/main" noChangeAspect="1"/>
+            </wp:cNvGraphicFramePr>
+            <a:graphic xmlns:a="http://schemas.openxmlformats.org/drawingml/2006/main">
+              <a:graphicData uri="http://schemas.openxmlformats.org/drawingml/2006/picture">
+                <pic:pic xmlns:pic="http://schemas.openxmlformats.org/drawingml/2006/picture">
+                  <pic:nvPicPr>
+                    <pic:cNvPr id="0" name="" descr=""/>
+                    <pic:cNvPicPr>
+                      <a:picLocks noChangeAspect="1" noChangeArrowheads="1"/>
+                    </pic:cNvPicPr>
+                  </pic:nvPicPr>
+                  <pic:blipFill>
+                    <a:blip r:embed="rId8" cstate="none"/>
+                    <a:srcRect/>
+                    <a:stretch>
+                      <a:fillRect/>
+                    </a:stretch>
+                  </pic:blipFill>
+                  <pic:spPr bwMode="auto">
+                    <a:xfrm>
+                      <a:off x="0" y="0"/>
+                      <a:ext cx="4381500" cy="5153025"/>
+                    </a:xfrm>
+                    <a:prstGeom prst="rect">
+                      <a:avLst/>
+                    </a:prstGeom>
+                  </pic:spPr>
+                </pic:pic>
+              </a:graphicData>
+            </a:graphic>
+          </wp:inline>
+        </w:drawing>
+      </w:r>
+    </w:p>
+    <w:p>
+      <w:pPr>
+        <w:spacing w:after="120"/>
+        <w:jc w:val="center"/>
+      </w:pPr>
+      <w:r>
+        <w:rPr>
+          <w:i/>
+          <w:iCs/>
+          <w:color w:val="777777"/>
+          <w:sz w:val="18"/>
+          <w:szCs w:val="18"/>
+        </w:rPr>
+        <w:t xml:space="preserve">Đồ thị luồng điều khiển</w:t>
+      </w:r>
+    </w:p>
+    <w:p>
+      <w:pPr>
+        <w:spacing w:after="40"/>
+      </w:pPr>
+      <w:r>
+        <w:t xml:space="preserve">Bạn cần kiểm thử bao nhiêu mục bao phủ (coverage items)?</w:t>
+      </w:r>
+    </w:p>
+    <w:p>
+      <w:pPr>
+        <w:spacing w:after="40"/>
+      </w:pPr>
+      <w:r>
+        <w:t xml:space="preserve">a) 2</w:t>
+      </w:r>
+    </w:p>
+    <w:p>
+      <w:pPr>
+        <w:spacing w:after="40"/>
+      </w:pPr>
+      <w:r>
+        <w:t xml:space="preserve">b) 4</w:t>
+      </w:r>
+    </w:p>
+    <w:p>
+      <w:pPr>
+        <w:spacing w:after="40"/>
+      </w:pPr>
+      <w:r>
+        <w:t xml:space="preserve">c) 8</w:t>
+      </w:r>
+    </w:p>
+    <w:p>
+      <w:pPr>
+        <w:spacing w:after="40"/>
+      </w:pPr>
+      <w:r>
+        <w:t xml:space="preserve">d) 7</w:t>
+      </w:r>
+    </w:p>
+    <w:p>
+      <w:pPr>
+        <w:spacing w:after="40"/>
+      </w:pPr>
+      <w:r>
+        <w:t xml:space="preserve">Chọn MỘT phương án.</w:t>
+      </w:r>
+    </w:p>
+    <w:p>
+      <w:pPr>
+        <w:pStyle w:val="Heading2"/>
+        <w:spacing w:after="80" w:before="200"/>
+      </w:pPr>
+      <w:r>
+        <w:rPr>
+          <w:b/>
+          <w:bCs/>
+        </w:rPr>
+        <w:t xml:space="preserve">Câu #25 (1 Điểm)</w:t>
+      </w:r>
+    </w:p>
+    <w:p>
+      <w:pPr>
+        <w:spacing w:after="40"/>
+      </w:pPr>
+      <w:r>
+        <w:t xml:space="preserve">Kiểm thử hộp trắng (white-box testing) có thể hữu ích như thế nào trong việc hỗ trợ kiểm thử hộp đen (black-box testing)?</w:t>
+      </w:r>
+    </w:p>
+    <w:p>
+      <w:pPr>
+        <w:spacing w:after="40"/>
+      </w:pPr>
+      <w:r>
+        <w:t xml:space="preserve">a) Các thước đo độ bao phủ hộp trắng có thể giúp các kiểm thử viên đánh giá các kiểm thử hộp đen dựa trên độ bao phủ mã nguồn đạt được bởi các kiểm thử hộp đen này</w:t>
+      </w:r>
+    </w:p>
+    <w:p>
+      <w:pPr>
+        <w:spacing w:after="40"/>
+      </w:pPr>
+      <w:r>
+        <w:t xml:space="preserve">b) Phân tích độ bao phủ hộp trắng có thể giúp các kiểm thử viên xác định các đoạn mã nguồn không thể đạt tới được</w:t>
+      </w:r>
+    </w:p>
+    <w:p>
+      <w:pPr>
+        <w:spacing w:after="40"/>
+      </w:pPr>
+      <w:r>
+        <w:t xml:space="preserve">c) Kiểm thử nhánh bao hàm (subsume) các kỹ thuật kiểm thử hộp đen, do đó đạt được độ bao phủ nhánh đầy đủ đảm bảo đạt được độ bao phủ đầy đủ của bất kỳ kỹ thuật hộp đen nào</w:t>
+      </w:r>
+    </w:p>
+    <w:p>
+      <w:pPr>
+        <w:spacing w:after="40"/>
+      </w:pPr>
+      <w:r>
+        <w:t xml:space="preserve">d) Các kỹ thuật kiểm thử hộp trắng có thể cung cấp các mục bao phủ cho các kỹ thuật hộp đen</w:t>
+      </w:r>
+    </w:p>
+    <w:p>
+      <w:pPr>
+        <w:spacing w:after="40"/>
+      </w:pPr>
+      <w:r>
+        <w:t xml:space="preserve">Chọn MỘT phương án.</w:t>
+      </w:r>
+    </w:p>
+    <w:p>
+      <w:pPr>
+        <w:pBdr>
+          <w:bottom w:val="single" w:color="AAAAAA" w:sz="6" w:space="1"/>
+        </w:pBdr>
+        <w:spacing w:after="120"/>
+      </w:pPr>
+    </w:p>
+    <w:p>
+      <w:pPr>
+        <w:spacing w:after="20"/>
+      </w:pPr>
+      <w:r>
+        <w:rPr>
+          <w:color w:val="888888"/>
+          <w:sz w:val="16"/>
+          <w:szCs w:val="16"/>
+        </w:rPr>
+        <w:t xml:space="preserve">Phiên bản 1.6 — Trang 16/21 — Ngày 25 tháng 3 năm 2025</w:t>
+      </w:r>
+    </w:p>
+    <w:p>
+      <w:pPr>
+        <w:spacing w:after="20"/>
+      </w:pPr>
+      <w:r>
+        <w:rPr>
+          <w:color w:val="888888"/>
+          <w:sz w:val="16"/>
+          <w:szCs w:val="16"/>
+        </w:rPr>
+        <w:t xml:space="preserve">© International Software Testing Qualifications Board</w:t>
+      </w:r>
+    </w:p>
+    <w:p>
+      <w:pPr>
+        <w:pStyle w:val="Heading2"/>
+        <w:spacing w:after="80" w:before="200"/>
+      </w:pPr>
+      <w:r>
+        <w:rPr>
+          <w:b/>
+          <w:bCs/>
+        </w:rPr>
+        <w:t xml:space="preserve">Câu #26 (1 Điểm)</w:t>
+      </w:r>
+    </w:p>
+    <w:p>
+      <w:pPr>
+        <w:spacing w:after="40"/>
+      </w:pPr>
+      <w:r>
+        <w:t xml:space="preserve">Xem xét danh sách sau:</w:t>
+      </w:r>
+    </w:p>
+    <w:p>
+      <w:pPr>
+        <w:pStyle w:val="ListParagraph"/>
+        <w:numPr>
+          <w:ilvl w:val="0"/>
+          <w:numId w:val="1"/>
+        </w:numPr>
+      </w:pPr>
+      <w:r>
+        <w:t xml:space="preserve">Đầu vào đúng không được chấp nhận</w:t>
+      </w:r>
+    </w:p>
+    <w:p>
+      <w:pPr>
+        <w:pStyle w:val="ListParagraph"/>
+        <w:numPr>
+          <w:ilvl w:val="0"/>
+          <w:numId w:val="1"/>
+        </w:numPr>
+      </w:pPr>
+      <w:r>
+        <w:t xml:space="preserve">Đầu vào sai được chấp nhận</w:t>
+      </w:r>
+    </w:p>
+    <w:p>
+      <w:pPr>
+        <w:pStyle w:val="ListParagraph"/>
+        <w:numPr>
+          <w:ilvl w:val="0"/>
+          <w:numId w:val="1"/>
+        </w:numPr>
+      </w:pPr>
+      <w:r>
+        <w:t xml:space="preserve">Định dạng đầu ra sai</w:t>
+      </w:r>
+    </w:p>
+    <w:p>
+      <w:pPr>
+        <w:pStyle w:val="ListParagraph"/>
+        <w:numPr>
+          <w:ilvl w:val="0"/>
+          <w:numId w:val="1"/>
+        </w:numPr>
+      </w:pPr>
+      <w:r>
+        <w:t xml:space="preserve">Chia cho không (Division by zero)</w:t>
+      </w:r>
+    </w:p>
+    <w:p>
+      <w:pPr>
+        <w:spacing w:after="40"/>
+      </w:pPr>
+      <w:r>
+        <w:t xml:space="preserve">Kỹ thuật kiểm thử nào CÓ NHIỀU KHẢ NĂNG NHẤT được sử dụng bởi kiểm thử viên dùng danh sách này khi thực hiện kiểm thử?</w:t>
+      </w:r>
+    </w:p>
+    <w:p>
+      <w:pPr>
+        <w:spacing w:after="40"/>
+      </w:pPr>
+      <w:r>
+        <w:t xml:space="preserve">a) Kiểm thử thăm dò (Exploratory testing)</w:t>
+      </w:r>
+    </w:p>
+    <w:p>
+      <w:pPr>
+        <w:spacing w:after="40"/>
+      </w:pPr>
+      <w:r>
+        <w:t xml:space="preserve">b) Tấn công lỗi (Fault attack)</w:t>
+      </w:r>
+    </w:p>
+    <w:p>
+      <w:pPr>
+        <w:spacing w:after="40"/>
+      </w:pPr>
+      <w:r>
+        <w:t xml:space="preserve">c) Kiểm thử dựa trên danh mục kiểm tra (Checklist-based testing)</w:t>
+      </w:r>
+    </w:p>
+    <w:p>
+      <w:pPr>
+        <w:spacing w:after="40"/>
+      </w:pPr>
+      <w:r>
+        <w:t xml:space="preserve">d) Phân tích giá trị biên (Boundary value analysis)</w:t>
+      </w:r>
+    </w:p>
+    <w:p>
+      <w:pPr>
+        <w:spacing w:after="40"/>
+      </w:pPr>
+      <w:r>
+        <w:t xml:space="preserve">Chọn MỘT phương án.</w:t>
+      </w:r>
+    </w:p>
+    <w:p>
+      <w:pPr>
+        <w:pStyle w:val="Heading2"/>
+        <w:spacing w:after="80" w:before="200"/>
+      </w:pPr>
+      <w:r>
+        <w:rPr>
+          <w:b/>
+          <w:bCs/>
+        </w:rPr>
+        <w:t xml:space="preserve">Câu #27 (1 Điểm)</w:t>
+      </w:r>
+    </w:p>
+    <w:p>
+      <w:pPr>
+        <w:spacing w:after="40"/>
+      </w:pPr>
+      <w:r>
+        <w:t xml:space="preserve">Điều nào sau đây MÔ TẢ TỐT NHẤT cách mà việc sử dụng kiểm thử dựa trên danh mục kiểm tra có thể dẫn đến tăng độ bao phủ?</w:t>
+      </w:r>
+    </w:p>
+    <w:p>
+      <w:pPr>
+        <w:spacing w:after="40"/>
+      </w:pPr>
+      <w:r>
+        <w:t xml:space="preserve">a) Các mục danh mục kiểm tra có thể được định nghĩa ở mức độ chi tiết đủ thấp, để kiểm thử viên có thể cài đặt và thực thi các ca kiểm thử chi tiết dựa trên các mục này</w:t>
+      </w:r>
+    </w:p>
+    <w:p>
+      <w:pPr>
+        <w:spacing w:after="40"/>
+      </w:pPr>
+      <w:r>
+        <w:t xml:space="preserve">b) Các danh mục kiểm tra có thể được tự động hóa, do đó mỗi lần một lần thực thi kiểm thử tự động bao phủ các mục danh mục kiểm tra, nó dẫn đến độ bao phủ bổ sung</w:t>
+      </w:r>
+    </w:p>
+    <w:p>
+      <w:pPr>
+        <w:spacing w:after="40"/>
+      </w:pPr>
+      <w:r>
+        <w:t xml:space="preserve">c) Mỗi mục danh mục kiểm tra nên được kiểm thử riêng biệt và độc lập, do đó các phần tử bao phủ các khu vực khác nhau của phần mềm</w:t>
+      </w:r>
+    </w:p>
+    <w:p>
+      <w:pPr>
+        <w:spacing w:after="40"/>
+      </w:pPr>
+      <w:r>
+        <w:t xml:space="preserve">d) Hai kiểm thử viên thiết kế và thực thi các kiểm thử dựa trên cùng các mục danh mục kiểm tra ở mức cao sẽ thường thực hiện việc kiểm thử theo những cách hơi khác nhau</w:t>
+      </w:r>
+    </w:p>
+    <w:p>
+      <w:pPr>
+        <w:spacing w:after="40"/>
+      </w:pPr>
+      <w:r>
+        <w:t xml:space="preserve">Chọn MỘT phương án.</w:t>
+      </w:r>
+    </w:p>
+    <w:p>
+      <w:pPr>
+        <w:pStyle w:val="Heading2"/>
+        <w:spacing w:after="80" w:before="200"/>
+      </w:pPr>
+      <w:r>
+        <w:rPr>
+          <w:b/>
+          <w:bCs/>
+        </w:rPr>
+        <w:t xml:space="preserve">Câu #28 (1 Điểm)</w:t>
+      </w:r>
+    </w:p>
+    <w:p>
+      <w:pPr>
+        <w:spacing w:after="40"/>
+      </w:pPr>
+      <w:r>
+        <w:t xml:space="preserve">Điều nào sau đây cung cấp ví dụ TỐT NHẤT về một tiêu chí chấp nhận (acceptance criterion) hướng kịch bản (scenario-oriented)?</w:t>
+      </w:r>
+    </w:p>
+    <w:p>
+      <w:pPr>
+        <w:spacing w:after="40"/>
+      </w:pPr>
+      <w:r>
+        <w:t xml:space="preserve">a) Ứng dụng phải cho phép người dùng xóa tài khoản của họ và tất cả dữ liệu liên quan theo yêu cầu</w:t>
+      </w:r>
+    </w:p>
+    <w:p>
+      <w:pPr>
+        <w:spacing w:after="40"/>
+      </w:pPr>
+      <w:r>
+        <w:t xml:space="preserve">b) Khi một khách hàng thêm một mặt hàng vào giỏ hàng của họ và tiến hành thanh toán, họ nên được nhắc đăng nhập hoặc tạo một tài khoản nếu họ chưa làm như vậy</w:t>
+      </w:r>
+    </w:p>
+    <w:p>
+      <w:pPr>
+        <w:spacing w:after="40"/>
+      </w:pPr>
+      <w:r>
+        <w:t xml:space="preserve">c) IF (contain(product(23).Name, cart.products())) THEN return FALSE</w:t>
+      </w:r>
+    </w:p>
+    <w:p>
+      <w:pPr>
+        <w:spacing w:after="40"/>
+      </w:pPr>
+      <w:r>
+        <w:t xml:space="preserve">d) Trang web phải tuân thủ Tiêu chuẩn Khả năng Tiếp cận ICT 508 và đảm bảo rằng tất cả nội dung có thể truy cập được đối với người dùng khuyết tật</w:t>
+      </w:r>
+    </w:p>
+    <w:p>
+      <w:pPr>
+        <w:spacing w:after="40"/>
+      </w:pPr>
+      <w:r>
+        <w:t xml:space="preserve">Chọn MỘT phương án.</w:t>
+      </w:r>
+    </w:p>
+    <w:p>
+      <w:pPr>
+        <w:pBdr>
+          <w:bottom w:val="single" w:color="AAAAAA" w:sz="6" w:space="1"/>
+        </w:pBdr>
+        <w:spacing w:after="120"/>
+      </w:pPr>
+    </w:p>
+    <w:p>
+      <w:pPr>
+        <w:spacing w:after="20"/>
+      </w:pPr>
+      <w:r>
+        <w:rPr>
+          <w:color w:val="888888"/>
+          <w:sz w:val="16"/>
+          <w:szCs w:val="16"/>
+        </w:rPr>
+        <w:t xml:space="preserve">Phiên bản 1.6 — Trang 17/21 — Ngày 25 tháng 3 năm 2025</w:t>
+      </w:r>
+    </w:p>
+    <w:p>
+      <w:pPr>
+        <w:spacing w:after="20"/>
+      </w:pPr>
+      <w:r>
+        <w:rPr>
+          <w:color w:val="888888"/>
+          <w:sz w:val="16"/>
+          <w:szCs w:val="16"/>
+        </w:rPr>
+        <w:t xml:space="preserve">© International Software Testing Qualifications Board</w:t>
+      </w:r>
+    </w:p>
+    <w:p>
+      <w:pPr>
+        <w:pStyle w:val="Heading2"/>
+        <w:spacing w:after="80" w:before="200"/>
+      </w:pPr>
+      <w:r>
+        <w:rPr>
+          <w:b/>
+          <w:bCs/>
+        </w:rPr>
+        <w:t xml:space="preserve">Câu #29 (1 Điểm)</w:t>
+      </w:r>
+    </w:p>
+    <w:p>
+      <w:pPr>
+        <w:spacing w:after="40"/>
+      </w:pPr>
+      <w:r>
+        <w:t xml:space="preserve">Bạn đang sử dụng phát triển hướng kiểm thử chấp nhận (acceptance test-driven development) và thiết kế các ca kiểm thử dựa trên câu chuyện người dùng (user story) sau đây:</w:t>
+      </w:r>
+    </w:p>
+    <w:p>
+      <w:pPr>
+        <w:spacing w:after="40"/>
+      </w:pPr>
+      <w:r>
+        <w:t xml:space="preserve">Là một người dùng Thường (Regular) hoặc Đặc biệt (Special), tôi muốn có thể sử dụng thẻ tầng điện tử của mình, để truy cập các tầng cụ thể.</w:t>
+      </w:r>
+    </w:p>
+    <w:p>
+      <w:pPr>
+        <w:spacing w:after="40"/>
+      </w:pPr>
+      <w:r>
+        <w:t xml:space="preserve">Tiêu chí chấp nhận:</w:t>
+      </w:r>
+    </w:p>
+    <w:p>
+      <w:pPr>
+        <w:spacing w:after="40"/>
+      </w:pPr>
+      <w:r>
+        <w:t xml:space="preserve">AC1: Người dùng Thường có quyền truy cập các tầng 1 đến 3</w:t>
+      </w:r>
+    </w:p>
+    <w:p>
+      <w:pPr>
+        <w:spacing w:after="40"/>
+      </w:pPr>
+      <w:r>
+        <w:t xml:space="preserve">AC2: Tầng 4 chỉ có thể được truy cập bởi người dùng Đặc biệt</w:t>
+      </w:r>
+    </w:p>
+    <w:p>
+      <w:pPr>
+        <w:spacing w:after="40"/>
+      </w:pPr>
+      <w:r>
+        <w:t xml:space="preserve">AC3: Người dùng Đặc biệt có tất cả các quyền truy cập của người dùng Thường</w:t>
+      </w:r>
+    </w:p>
+    <w:p>
+      <w:pPr>
+        <w:spacing w:after="40"/>
+      </w:pPr>
+      <w:r>
+        <w:t xml:space="preserve">Ca kiểm thử nào là hợp lý NHẤT để kiểm thử AC3?</w:t>
+      </w:r>
+    </w:p>
+    <w:p>
+      <w:pPr>
+        <w:spacing w:after="40"/>
+      </w:pPr>
+      <w:r>
+        <w:t xml:space="preserve">a) Kiểm tra rằng một người dùng Thường có thể truy cập các tầng 1 và 3</w:t>
+      </w:r>
+    </w:p>
+    <w:p>
+      <w:pPr>
+        <w:spacing w:after="40"/>
+      </w:pPr>
+      <w:r>
+        <w:t xml:space="preserve">b) Kiểm tra rằng một người dùng Thường không thể truy cập tầng 4</w:t>
+      </w:r>
+    </w:p>
+    <w:p>
+      <w:pPr>
+        <w:spacing w:after="40"/>
+      </w:pPr>
+      <w:r>
+        <w:t xml:space="preserve">c) Kiểm tra rằng một người dùng Đặc biệt có thể truy cập tầng 5</w:t>
+      </w:r>
+    </w:p>
+    <w:p>
+      <w:pPr>
+        <w:spacing w:after="40"/>
+      </w:pPr>
+      <w:r>
+        <w:t xml:space="preserve">d) Kiểm tra rằng một người dùng Đặc biệt có thể truy cập các tầng 1, 2 và 3</w:t>
+      </w:r>
+    </w:p>
+    <w:p>
+      <w:pPr>
+        <w:spacing w:after="40"/>
+      </w:pPr>
+      <w:r>
+        <w:t xml:space="preserve">Chọn MỘT phương án.</w:t>
+      </w:r>
+    </w:p>
+    <w:p>
+      <w:pPr>
+        <w:pStyle w:val="Heading2"/>
+        <w:spacing w:after="80" w:before="200"/>
+      </w:pPr>
+      <w:r>
+        <w:rPr>
+          <w:b/>
+          <w:bCs/>
+        </w:rPr>
+        <w:t xml:space="preserve">Câu #30 (1 Điểm)</w:t>
+      </w:r>
+    </w:p>
+    <w:p>
+      <w:pPr>
+        <w:spacing w:after="40"/>
+      </w:pPr>
+      <w:r>
+        <w:t xml:space="preserve">Điều nào sau đây KHÔNG phải là một mục đích của kế hoạch kiểm thử (test plan)?</w:t>
+      </w:r>
+    </w:p>
+    <w:p>
+      <w:pPr>
+        <w:spacing w:after="40"/>
+      </w:pPr>
+      <w:r>
+        <w:t xml:space="preserve">a) Định nghĩa dữ liệu kiểm thử và kết quả mong đợi cho kiểm thử thành phần và kiểm thử tích hợp thành phần</w:t>
+      </w:r>
+    </w:p>
+    <w:p>
+      <w:pPr>
+        <w:spacing w:after="40"/>
+      </w:pPr>
+      <w:r>
+        <w:t xml:space="preserve">b) Định nghĩa như một tiêu chí thoát (exit criteria) khỏi cấp độ kiểm thử thành phần rằng "phải đạt được 100% độ bao phủ câu lệnh và 100% độ bao phủ nhánh"</w:t>
+      </w:r>
+    </w:p>
+    <w:p>
+      <w:pPr>
+        <w:spacing w:after="40"/>
+      </w:pPr>
+      <w:r>
+        <w:t xml:space="preserve">c) Mô tả báo cáo tiến độ kiểm thử sẽ chứa những trường nào và hình thức của báo cáo này nên như thế nào</w:t>
+      </w:r>
+    </w:p>
+    <w:p>
+      <w:pPr>
+        <w:spacing w:after="40"/>
+      </w:pPr>
+      <w:r>
+        <w:t xml:space="preserve">d) Giải thích tại sao kiểm thử tích hợp hệ thống sẽ bị loại trừ khỏi việc kiểm thử, mặc dù chiến lược kiểm thử yêu cầu cấp độ kiểm thử này</w:t>
+      </w:r>
+    </w:p>
+    <w:p>
+      <w:pPr>
+        <w:spacing w:after="40"/>
+      </w:pPr>
+      <w:r>
+        <w:t xml:space="preserve">Chọn MỘT phương án.</w:t>
+      </w:r>
+    </w:p>
+    <w:p>
+      <w:pPr>
+        <w:pBdr>
+          <w:bottom w:val="single" w:color="AAAAAA" w:sz="6" w:space="1"/>
+        </w:pBdr>
+        <w:spacing w:after="120"/>
+      </w:pPr>
+    </w:p>
+    <w:p>
+      <w:pPr>
+        <w:spacing w:after="20"/>
+      </w:pPr>
+      <w:r>
+        <w:rPr>
+          <w:color w:val="888888"/>
+          <w:sz w:val="16"/>
+          <w:szCs w:val="16"/>
+        </w:rPr>
+        <w:t xml:space="preserve">Phiên bản 1.6 — Trang 18/21 — Ngày 25 tháng 3 năm 2025</w:t>
+      </w:r>
+    </w:p>
+    <w:p>
+      <w:pPr>
+        <w:spacing w:after="20"/>
+      </w:pPr>
+      <w:r>
+        <w:rPr>
+          <w:color w:val="888888"/>
+          <w:sz w:val="16"/>
+          <w:szCs w:val="16"/>
+        </w:rPr>
+        <w:t xml:space="preserve">© International Software Testing Qualifications Board</w:t>
+      </w:r>
+    </w:p>
+    <w:p>
+      <w:pPr>
+        <w:pStyle w:val="Heading2"/>
+        <w:spacing w:after="80" w:before="200"/>
+      </w:pPr>
+      <w:r>
+        <w:rPr>
+          <w:b/>
+          <w:bCs/>
+        </w:rPr>
+        <w:t xml:space="preserve">Câu #31 (1 Điểm)</w:t>
+      </w:r>
+    </w:p>
+    <w:p>
+      <w:pPr>
+        <w:spacing w:after="40"/>
+      </w:pPr>
+      <w:r>
+        <w:t xml:space="preserve">Vào đầu mỗi vòng lặp (iteration), nhóm ước lượng khối lượng công việc (tính bằng người-ngày) mà họ sẽ cần hoàn thành trong vòng lặp đó. Gọi E(n) là khối lượng công việc ước lượng cho vòng lặp n, và gọi A(n) là khối lượng công việc thực tế đã hoàn thành trong vòng lặp n. Từ vòng lặp thứ ba, nhóm sử dụng mô hình ước lượng sau dựa trên phép ngoại suy (extrapolation):</w:t>
+      </w:r>
+    </w:p>
+    <w:p>
+      <w:pPr>
+        <w:spacing w:after="40"/>
+      </w:pPr>
+      <w:r>
+        <w:t xml:space="preserve">E(n) = ( 3 * A(n-1) + A(n-2) ) / 4</w:t>
+      </w:r>
+    </w:p>
+    <w:p>
+      <w:pPr>
+        <w:spacing w:after="40"/>
+      </w:pPr>
+      <w:r>
+        <w:t xml:space="preserve">Biểu đồ cho thấy khối lượng công việc ước lượng và thực tế cho bốn vòng lặp đầu tiên.</w:t>
+      </w:r>
+    </w:p>
+    <w:p>
+      <w:pPr>
+        <w:spacing w:after="40" w:before="80"/>
+        <w:jc w:val="center"/>
+      </w:pPr>
+      <w:r>
+        <w:drawing>
+          <wp:inline distT="0" distB="0" distL="0" distR="0">
+            <wp:extent cx="4381500" cy="1981200"/>
+            <wp:effectExtent t="0" r="0" b="0" l="0"/>
+            <wp:docPr id="1" name="" descr="" title=""/>
+            <wp:cNvGraphicFramePr>
+              <a:graphicFrameLocks xmlns:a="http://schemas.openxmlformats.org/drawingml/2006/main" noChangeAspect="1"/>
+            </wp:cNvGraphicFramePr>
+            <a:graphic xmlns:a="http://schemas.openxmlformats.org/drawingml/2006/main">
+              <a:graphicData uri="http://schemas.openxmlformats.org/drawingml/2006/picture">
+                <pic:pic xmlns:pic="http://schemas.openxmlformats.org/drawingml/2006/picture">
+                  <pic:nvPicPr>
+                    <pic:cNvPr id="0" name="" descr=""/>
+                    <pic:cNvPicPr>
+                      <a:picLocks noChangeAspect="1" noChangeArrowheads="1"/>
+                    </pic:cNvPicPr>
+                  </pic:nvPicPr>
+                  <pic:blipFill>
+                    <a:blip r:embed="rId9" cstate="none"/>
+                    <a:srcRect/>
+                    <a:stretch>
+                      <a:fillRect/>
+                    </a:stretch>
+                  </pic:blipFill>
+                  <pic:spPr bwMode="auto">
+                    <a:xfrm>
+                      <a:off x="0" y="0"/>
+                      <a:ext cx="4381500" cy="1981200"/>
+                    </a:xfrm>
+                    <a:prstGeom prst="rect">
+                      <a:avLst/>
+                    </a:prstGeom>
+                  </pic:spPr>
+                </pic:pic>
+              </a:graphicData>
+            </a:graphic>
+          </wp:inline>
+        </w:drawing>
+      </w:r>
+    </w:p>
+    <w:p>
+      <w:pPr>
+        <w:spacing w:after="120"/>
+        <w:jc w:val="center"/>
+      </w:pPr>
+      <w:r>
+        <w:rPr>
+          <w:i/>
+          <w:iCs/>
+          <w:color w:val="777777"/>
+          <w:sz w:val="18"/>
+          <w:szCs w:val="18"/>
+        </w:rPr>
+        <w:t xml:space="preserve">Biểu đồ nỗ lực ước lượng và thực tế</w:t>
+      </w:r>
+    </w:p>
+    <w:p>
+      <w:pPr>
         <w:shd w:fill="F2F2F2" w:val="clear"/>
         <w:spacing w:after="40"/>
         <w:ind w:left="360"/>
@@ -2640,47 +3586,47 @@
           <w:sz w:val="20"/>
           <w:szCs w:val="20"/>
         </w:rPr>
-        <w:t xml:space="preserve">[HÌNH ẢNH: Sơ đồ chuyển trạng thái — giữ nguyên hình ảnh gốc từ tài liệu.]</w:t>
-      </w:r>
-    </w:p>
-    <w:p>
-      <w:pPr>
-        <w:spacing w:after="40"/>
-      </w:pPr>
-      <w:r>
-        <w:t xml:space="preserve">Số lượng ca kiểm thử TỐI THIỂU cần thiết để đạt được 100% độ bao phủ chuyển trạng thái hợp lệ (valid transitions coverage) là bao nhiêu?</w:t>
-      </w:r>
-    </w:p>
-    <w:p>
-      <w:pPr>
-        <w:spacing w:after="40"/>
-      </w:pPr>
-      <w:r>
-        <w:t xml:space="preserve">a) 3</w:t>
-      </w:r>
-    </w:p>
-    <w:p>
-      <w:pPr>
-        <w:spacing w:after="40"/>
-      </w:pPr>
-      <w:r>
-        <w:t xml:space="preserve">b) 2</w:t>
-      </w:r>
-    </w:p>
-    <w:p>
-      <w:pPr>
-        <w:spacing w:after="40"/>
-      </w:pPr>
-      <w:r>
-        <w:t xml:space="preserve">c) 5</w:t>
-      </w:r>
-    </w:p>
-    <w:p>
-      <w:pPr>
-        <w:spacing w:after="40"/>
-      </w:pPr>
-      <w:r>
-        <w:t xml:space="preserve">d) 6</w:t>
+        <w:t xml:space="preserve">Chú thích nhãn biểu đồ: Tiêu đề "Estimated and actual effort (in person-days)" = Nỗ lực ước lượng và thực tế (tính bằng người-ngày); Iteration #1..#4 = Vòng lặp #1..#4; Estimated = Ước lượng; Actual = Thực tế.</w:t>
+      </w:r>
+    </w:p>
+    <w:p>
+      <w:pPr>
+        <w:spacing w:after="40"/>
+      </w:pPr>
+      <w:r>
+        <w:t xml:space="preserve">Khối lượng công việc ước lượng cho vòng lặp #5 là bao nhiêu?</w:t>
+      </w:r>
+    </w:p>
+    <w:p>
+      <w:pPr>
+        <w:spacing w:after="40"/>
+      </w:pPr>
+      <w:r>
+        <w:t xml:space="preserve">a) 10,5 người-ngày</w:t>
+      </w:r>
+    </w:p>
+    <w:p>
+      <w:pPr>
+        <w:spacing w:after="40"/>
+      </w:pPr>
+      <w:r>
+        <w:t xml:space="preserve">b) 8,25 người-ngày</w:t>
+      </w:r>
+    </w:p>
+    <w:p>
+      <w:pPr>
+        <w:spacing w:after="40"/>
+      </w:pPr>
+      <w:r>
+        <w:t xml:space="preserve">c) 6,5 người-ngày</w:t>
+      </w:r>
+    </w:p>
+    <w:p>
+      <w:pPr>
+        <w:spacing w:after="40"/>
+      </w:pPr>
+      <w:r>
+        <w:t xml:space="preserve">d) 9,4 người-ngày</w:t>
       </w:r>
     </w:p>
     <w:p>
@@ -2709,7 +3655,7 @@
           <w:sz w:val="16"/>
           <w:szCs w:val="16"/>
         </w:rPr>
-        <w:t xml:space="preserve">Phiên bản 1.6 — Trang 15/21 — Ngày 25 tháng 3 năm 2025</w:t>
+        <w:t xml:space="preserve">Phiên bản 1.6 — Trang 19/21 — Ngày 25 tháng 3 năm 2025</w:t>
       </w:r>
     </w:p>
     <w:p>
@@ -2735,893 +3681,93 @@
           <w:b/>
           <w:bCs/>
         </w:rPr>
-        <w:t xml:space="preserve">Câu #24 (1 Điểm)</w:t>
-      </w:r>
-    </w:p>
-    <w:p>
-      <w:pPr>
-        <w:spacing w:after="40"/>
-      </w:pPr>
-      <w:r>
-        <w:t xml:space="preserve">Bạn muốn áp dụng kiểm thử nhánh (branch testing) cho đoạn mã được biểu diễn bởi đồ thị luồng điều khiển (control flow graph) sau đây.</w:t>
-      </w:r>
-    </w:p>
-    <w:p>
-      <w:pPr>
-        <w:shd w:fill="F2F2F2" w:val="clear"/>
-        <w:spacing w:after="40"/>
-        <w:ind w:left="360"/>
+        <w:t xml:space="preserve">Câu #32 (1 Điểm)</w:t>
+      </w:r>
+    </w:p>
+    <w:p>
+      <w:pPr>
+        <w:spacing w:after="40"/>
+      </w:pPr>
+      <w:r>
+        <w:t xml:space="preserve">Bạn đang chuẩn bị một lịch thực thi kiểm thử để thực thi bảy ca kiểm thử TC 1 đến TC 7.</w:t>
+      </w:r>
+    </w:p>
+    <w:p>
+      <w:pPr>
+        <w:spacing w:after="40"/>
+      </w:pPr>
+      <w:r>
+        <w:t xml:space="preserve">Hình sau đây bao gồm các mức độ ưu tiên của các ca kiểm thử này (1 = ưu tiên cao nhất, 3 = ưu tiên thấp nhất).</w:t>
+      </w:r>
+    </w:p>
+    <w:p>
+      <w:pPr>
+        <w:spacing w:after="40"/>
+      </w:pPr>
+      <w:r>
+        <w:t xml:space="preserve">Hình cũng cho thấy các phụ thuộc giữa các ca kiểm thử bằng các mũi tên. Ví dụ, mũi tên từ TC 4 đến TC 5 nghĩa là TC 5 chỉ có thể được thực thi nếu TC 4 đã được thực thi trước đó.</w:t>
+      </w:r>
+    </w:p>
+    <w:p>
+      <w:pPr>
+        <w:spacing w:after="40" w:before="80"/>
+        <w:jc w:val="center"/>
+      </w:pPr>
+      <w:r>
+        <w:drawing>
+          <wp:inline distT="0" distB="0" distL="0" distR="0">
+            <wp:extent cx="4381500" cy="1371600"/>
+            <wp:effectExtent t="0" r="0" b="0" l="0"/>
+            <wp:docPr id="1" name="" descr="" title=""/>
+            <wp:cNvGraphicFramePr>
+              <a:graphicFrameLocks xmlns:a="http://schemas.openxmlformats.org/drawingml/2006/main" noChangeAspect="1"/>
+            </wp:cNvGraphicFramePr>
+            <a:graphic xmlns:a="http://schemas.openxmlformats.org/drawingml/2006/main">
+              <a:graphicData uri="http://schemas.openxmlformats.org/drawingml/2006/picture">
+                <pic:pic xmlns:pic="http://schemas.openxmlformats.org/drawingml/2006/picture">
+                  <pic:nvPicPr>
+                    <pic:cNvPr id="0" name="" descr=""/>
+                    <pic:cNvPicPr>
+                      <a:picLocks noChangeAspect="1" noChangeArrowheads="1"/>
+                    </pic:cNvPicPr>
+                  </pic:nvPicPr>
+                  <pic:blipFill>
+                    <a:blip r:embed="rId10" cstate="none"/>
+                    <a:srcRect/>
+                    <a:stretch>
+                      <a:fillRect/>
+                    </a:stretch>
+                  </pic:blipFill>
+                  <pic:spPr bwMode="auto">
+                    <a:xfrm>
+                      <a:off x="0" y="0"/>
+                      <a:ext cx="4381500" cy="1371600"/>
+                    </a:xfrm>
+                    <a:prstGeom prst="rect">
+                      <a:avLst/>
+                    </a:prstGeom>
+                  </pic:spPr>
+                </pic:pic>
+              </a:graphicData>
+            </a:graphic>
+          </wp:inline>
+        </w:drawing>
+      </w:r>
+    </w:p>
+    <w:p>
+      <w:pPr>
+        <w:spacing w:after="120"/>
+        <w:jc w:val="center"/>
       </w:pPr>
       <w:r>
         <w:rPr>
           <w:i/>
           <w:iCs/>
-          <w:color w:val="555555"/>
-          <w:sz w:val="20"/>
-          <w:szCs w:val="20"/>
-        </w:rPr>
-        <w:t xml:space="preserve">[HÌNH ẢNH: Đồ thị luồng điều khiển — giữ nguyên hình ảnh gốc từ tài liệu.]</w:t>
-      </w:r>
-    </w:p>
-    <w:p>
-      <w:pPr>
-        <w:spacing w:after="40"/>
-      </w:pPr>
-      <w:r>
-        <w:t xml:space="preserve">Bạn cần kiểm thử bao nhiêu mục bao phủ (coverage items)?</w:t>
-      </w:r>
-    </w:p>
-    <w:p>
-      <w:pPr>
-        <w:spacing w:after="40"/>
-      </w:pPr>
-      <w:r>
-        <w:t xml:space="preserve">a) 2</w:t>
-      </w:r>
-    </w:p>
-    <w:p>
-      <w:pPr>
-        <w:spacing w:after="40"/>
-      </w:pPr>
-      <w:r>
-        <w:t xml:space="preserve">b) 4</w:t>
-      </w:r>
-    </w:p>
-    <w:p>
-      <w:pPr>
-        <w:spacing w:after="40"/>
-      </w:pPr>
-      <w:r>
-        <w:t xml:space="preserve">c) 8</w:t>
-      </w:r>
-    </w:p>
-    <w:p>
-      <w:pPr>
-        <w:spacing w:after="40"/>
-      </w:pPr>
-      <w:r>
-        <w:t xml:space="preserve">d) 7</w:t>
-      </w:r>
-    </w:p>
-    <w:p>
-      <w:pPr>
-        <w:spacing w:after="40"/>
-      </w:pPr>
-      <w:r>
-        <w:t xml:space="preserve">Chọn MỘT phương án.</w:t>
-      </w:r>
-    </w:p>
-    <w:p>
-      <w:pPr>
-        <w:pStyle w:val="Heading2"/>
-        <w:spacing w:after="80" w:before="200"/>
-      </w:pPr>
-      <w:r>
-        <w:rPr>
-          <w:b/>
-          <w:bCs/>
-        </w:rPr>
-        <w:t xml:space="preserve">Câu #25 (1 Điểm)</w:t>
-      </w:r>
-    </w:p>
-    <w:p>
-      <w:pPr>
-        <w:spacing w:after="40"/>
-      </w:pPr>
-      <w:r>
-        <w:t xml:space="preserve">Kiểm thử hộp trắng (white-box testing) có thể hữu ích như thế nào trong việc hỗ trợ kiểm thử hộp đen (black-box testing)?</w:t>
-      </w:r>
-    </w:p>
-    <w:p>
-      <w:pPr>
-        <w:spacing w:after="40"/>
-      </w:pPr>
-      <w:r>
-        <w:t xml:space="preserve">a) Các thước đo độ bao phủ hộp trắng có thể giúp các kiểm thử viên đánh giá các kiểm thử hộp đen dựa trên độ bao phủ mã nguồn đạt được bởi các kiểm thử hộp đen này</w:t>
-      </w:r>
-    </w:p>
-    <w:p>
-      <w:pPr>
-        <w:spacing w:after="40"/>
-      </w:pPr>
-      <w:r>
-        <w:t xml:space="preserve">b) Phân tích độ bao phủ hộp trắng có thể giúp các kiểm thử viên xác định các đoạn mã nguồn không thể đạt tới được</w:t>
-      </w:r>
-    </w:p>
-    <w:p>
-      <w:pPr>
-        <w:spacing w:after="40"/>
-      </w:pPr>
-      <w:r>
-        <w:t xml:space="preserve">c) Kiểm thử nhánh bao hàm (subsume) các kỹ thuật kiểm thử hộp đen, do đó đạt được độ bao phủ nhánh đầy đủ đảm bảo đạt được độ bao phủ đầy đủ của bất kỳ kỹ thuật hộp đen nào</w:t>
-      </w:r>
-    </w:p>
-    <w:p>
-      <w:pPr>
-        <w:spacing w:after="40"/>
-      </w:pPr>
-      <w:r>
-        <w:t xml:space="preserve">d) Các kỹ thuật kiểm thử hộp trắng có thể cung cấp các mục bao phủ cho các kỹ thuật hộp đen</w:t>
-      </w:r>
-    </w:p>
-    <w:p>
-      <w:pPr>
-        <w:spacing w:after="40"/>
-      </w:pPr>
-      <w:r>
-        <w:t xml:space="preserve">Chọn MỘT phương án.</w:t>
-      </w:r>
-    </w:p>
-    <w:p>
-      <w:pPr>
-        <w:pBdr>
-          <w:bottom w:val="single" w:color="AAAAAA" w:sz="6" w:space="1"/>
-        </w:pBdr>
-        <w:spacing w:after="120"/>
-      </w:pPr>
-    </w:p>
-    <w:p>
-      <w:pPr>
-        <w:spacing w:after="20"/>
-      </w:pPr>
-      <w:r>
-        <w:rPr>
-          <w:color w:val="888888"/>
-          <w:sz w:val="16"/>
-          <w:szCs w:val="16"/>
-        </w:rPr>
-        <w:t xml:space="preserve">Phiên bản 1.6 — Trang 16/21 — Ngày 25 tháng 3 năm 2025</w:t>
-      </w:r>
-    </w:p>
-    <w:p>
-      <w:pPr>
-        <w:spacing w:after="20"/>
-      </w:pPr>
-      <w:r>
-        <w:rPr>
-          <w:color w:val="888888"/>
-          <w:sz w:val="16"/>
-          <w:szCs w:val="16"/>
-        </w:rPr>
-        <w:t xml:space="preserve">© International Software Testing Qualifications Board</w:t>
-      </w:r>
-    </w:p>
-    <w:p>
-      <w:pPr>
-        <w:pStyle w:val="Heading2"/>
-        <w:spacing w:after="80" w:before="200"/>
-      </w:pPr>
-      <w:r>
-        <w:rPr>
-          <w:b/>
-          <w:bCs/>
-        </w:rPr>
-        <w:t xml:space="preserve">Câu #26 (1 Điểm)</w:t>
-      </w:r>
-    </w:p>
-    <w:p>
-      <w:pPr>
-        <w:spacing w:after="40"/>
-      </w:pPr>
-      <w:r>
-        <w:t xml:space="preserve">Xem xét danh sách sau:</w:t>
-      </w:r>
-    </w:p>
-    <w:p>
-      <w:pPr>
-        <w:pStyle w:val="ListParagraph"/>
-        <w:numPr>
-          <w:ilvl w:val="0"/>
-          <w:numId w:val="1"/>
-        </w:numPr>
-      </w:pPr>
-      <w:r>
-        <w:t xml:space="preserve">Đầu vào đúng không được chấp nhận</w:t>
-      </w:r>
-    </w:p>
-    <w:p>
-      <w:pPr>
-        <w:pStyle w:val="ListParagraph"/>
-        <w:numPr>
-          <w:ilvl w:val="0"/>
-          <w:numId w:val="1"/>
-        </w:numPr>
-      </w:pPr>
-      <w:r>
-        <w:t xml:space="preserve">Đầu vào sai được chấp nhận</w:t>
-      </w:r>
-    </w:p>
-    <w:p>
-      <w:pPr>
-        <w:pStyle w:val="ListParagraph"/>
-        <w:numPr>
-          <w:ilvl w:val="0"/>
-          <w:numId w:val="1"/>
-        </w:numPr>
-      </w:pPr>
-      <w:r>
-        <w:t xml:space="preserve">Định dạng đầu ra sai</w:t>
-      </w:r>
-    </w:p>
-    <w:p>
-      <w:pPr>
-        <w:pStyle w:val="ListParagraph"/>
-        <w:numPr>
-          <w:ilvl w:val="0"/>
-          <w:numId w:val="1"/>
-        </w:numPr>
-      </w:pPr>
-      <w:r>
-        <w:t xml:space="preserve">Chia cho không (Division by zero)</w:t>
-      </w:r>
-    </w:p>
-    <w:p>
-      <w:pPr>
-        <w:spacing w:after="40"/>
-      </w:pPr>
-      <w:r>
-        <w:t xml:space="preserve">Kỹ thuật kiểm thử nào CÓ NHIỀU KHẢ NĂNG NHẤT được sử dụng bởi kiểm thử viên dùng danh sách này khi thực hiện kiểm thử?</w:t>
-      </w:r>
-    </w:p>
-    <w:p>
-      <w:pPr>
-        <w:spacing w:after="40"/>
-      </w:pPr>
-      <w:r>
-        <w:t xml:space="preserve">a) Kiểm thử thăm dò (Exploratory testing)</w:t>
-      </w:r>
-    </w:p>
-    <w:p>
-      <w:pPr>
-        <w:spacing w:after="40"/>
-      </w:pPr>
-      <w:r>
-        <w:t xml:space="preserve">b) Tấn công lỗi (Fault attack)</w:t>
-      </w:r>
-    </w:p>
-    <w:p>
-      <w:pPr>
-        <w:spacing w:after="40"/>
-      </w:pPr>
-      <w:r>
-        <w:t xml:space="preserve">c) Kiểm thử dựa trên danh mục kiểm tra (Checklist-based testing)</w:t>
-      </w:r>
-    </w:p>
-    <w:p>
-      <w:pPr>
-        <w:spacing w:after="40"/>
-      </w:pPr>
-      <w:r>
-        <w:t xml:space="preserve">d) Phân tích giá trị biên (Boundary value analysis)</w:t>
-      </w:r>
-    </w:p>
-    <w:p>
-      <w:pPr>
-        <w:spacing w:after="40"/>
-      </w:pPr>
-      <w:r>
-        <w:t xml:space="preserve">Chọn MỘT phương án.</w:t>
-      </w:r>
-    </w:p>
-    <w:p>
-      <w:pPr>
-        <w:pStyle w:val="Heading2"/>
-        <w:spacing w:after="80" w:before="200"/>
-      </w:pPr>
-      <w:r>
-        <w:rPr>
-          <w:b/>
-          <w:bCs/>
-        </w:rPr>
-        <w:t xml:space="preserve">Câu #27 (1 Điểm)</w:t>
-      </w:r>
-    </w:p>
-    <w:p>
-      <w:pPr>
-        <w:spacing w:after="40"/>
-      </w:pPr>
-      <w:r>
-        <w:t xml:space="preserve">Điều nào sau đây MÔ TẢ TỐT NHẤT cách mà việc sử dụng kiểm thử dựa trên danh mục kiểm tra có thể dẫn đến tăng độ bao phủ?</w:t>
-      </w:r>
-    </w:p>
-    <w:p>
-      <w:pPr>
-        <w:spacing w:after="40"/>
-      </w:pPr>
-      <w:r>
-        <w:t xml:space="preserve">a) Các mục danh mục kiểm tra có thể được định nghĩa ở mức độ chi tiết đủ thấp, để kiểm thử viên có thể cài đặt và thực thi các ca kiểm thử chi tiết dựa trên các mục này</w:t>
-      </w:r>
-    </w:p>
-    <w:p>
-      <w:pPr>
-        <w:spacing w:after="40"/>
-      </w:pPr>
-      <w:r>
-        <w:t xml:space="preserve">b) Các danh mục kiểm tra có thể được tự động hóa, do đó mỗi lần một lần thực thi kiểm thử tự động bao phủ các mục danh mục kiểm tra, nó dẫn đến độ bao phủ bổ sung</w:t>
-      </w:r>
-    </w:p>
-    <w:p>
-      <w:pPr>
-        <w:spacing w:after="40"/>
-      </w:pPr>
-      <w:r>
-        <w:t xml:space="preserve">c) Mỗi mục danh mục kiểm tra nên được kiểm thử riêng biệt và độc lập, do đó các phần tử bao phủ các khu vực khác nhau của phần mềm</w:t>
-      </w:r>
-    </w:p>
-    <w:p>
-      <w:pPr>
-        <w:spacing w:after="40"/>
-      </w:pPr>
-      <w:r>
-        <w:t xml:space="preserve">d) Hai kiểm thử viên thiết kế và thực thi các kiểm thử dựa trên cùng các mục danh mục kiểm tra ở mức cao sẽ thường thực hiện việc kiểm thử theo những cách hơi khác nhau</w:t>
-      </w:r>
-    </w:p>
-    <w:p>
-      <w:pPr>
-        <w:spacing w:after="40"/>
-      </w:pPr>
-      <w:r>
-        <w:t xml:space="preserve">Chọn MỘT phương án.</w:t>
-      </w:r>
-    </w:p>
-    <w:p>
-      <w:pPr>
-        <w:pStyle w:val="Heading2"/>
-        <w:spacing w:after="80" w:before="200"/>
-      </w:pPr>
-      <w:r>
-        <w:rPr>
-          <w:b/>
-          <w:bCs/>
-        </w:rPr>
-        <w:t xml:space="preserve">Câu #28 (1 Điểm)</w:t>
-      </w:r>
-    </w:p>
-    <w:p>
-      <w:pPr>
-        <w:spacing w:after="40"/>
-      </w:pPr>
-      <w:r>
-        <w:t xml:space="preserve">Điều nào sau đây cung cấp ví dụ TỐT NHẤT về một tiêu chí chấp nhận (acceptance criterion) hướng kịch bản (scenario-oriented)?</w:t>
-      </w:r>
-    </w:p>
-    <w:p>
-      <w:pPr>
-        <w:spacing w:after="40"/>
-      </w:pPr>
-      <w:r>
-        <w:t xml:space="preserve">a) Ứng dụng phải cho phép người dùng xóa tài khoản của họ và tất cả dữ liệu liên quan theo yêu cầu</w:t>
-      </w:r>
-    </w:p>
-    <w:p>
-      <w:pPr>
-        <w:spacing w:after="40"/>
-      </w:pPr>
-      <w:r>
-        <w:t xml:space="preserve">b) Khi một khách hàng thêm một mặt hàng vào giỏ hàng của họ và tiến hành thanh toán, họ nên được nhắc đăng nhập hoặc tạo một tài khoản nếu họ chưa làm như vậy</w:t>
-      </w:r>
-    </w:p>
-    <w:p>
-      <w:pPr>
-        <w:spacing w:after="40"/>
-      </w:pPr>
-      <w:r>
-        <w:t xml:space="preserve">c) IF (contain(product(23).Name, cart.products())) THEN return FALSE</w:t>
-      </w:r>
-    </w:p>
-    <w:p>
-      <w:pPr>
-        <w:spacing w:after="40"/>
-      </w:pPr>
-      <w:r>
-        <w:t xml:space="preserve">d) Trang web phải tuân thủ Tiêu chuẩn Khả năng Tiếp cận ICT 508 và đảm bảo rằng tất cả nội dung có thể truy cập được đối với người dùng khuyết tật</w:t>
-      </w:r>
-    </w:p>
-    <w:p>
-      <w:pPr>
-        <w:spacing w:after="40"/>
-      </w:pPr>
-      <w:r>
-        <w:t xml:space="preserve">Chọn MỘT phương án.</w:t>
-      </w:r>
-    </w:p>
-    <w:p>
-      <w:pPr>
-        <w:pBdr>
-          <w:bottom w:val="single" w:color="AAAAAA" w:sz="6" w:space="1"/>
-        </w:pBdr>
-        <w:spacing w:after="120"/>
-      </w:pPr>
-    </w:p>
-    <w:p>
-      <w:pPr>
-        <w:spacing w:after="20"/>
-      </w:pPr>
-      <w:r>
-        <w:rPr>
-          <w:color w:val="888888"/>
-          <w:sz w:val="16"/>
-          <w:szCs w:val="16"/>
-        </w:rPr>
-        <w:t xml:space="preserve">Phiên bản 1.6 — Trang 17/21 — Ngày 25 tháng 3 năm 2025</w:t>
-      </w:r>
-    </w:p>
-    <w:p>
-      <w:pPr>
-        <w:spacing w:after="20"/>
-      </w:pPr>
-      <w:r>
-        <w:rPr>
-          <w:color w:val="888888"/>
-          <w:sz w:val="16"/>
-          <w:szCs w:val="16"/>
-        </w:rPr>
-        <w:t xml:space="preserve">© International Software Testing Qualifications Board</w:t>
-      </w:r>
-    </w:p>
-    <w:p>
-      <w:pPr>
-        <w:pStyle w:val="Heading2"/>
-        <w:spacing w:after="80" w:before="200"/>
-      </w:pPr>
-      <w:r>
-        <w:rPr>
-          <w:b/>
-          <w:bCs/>
-        </w:rPr>
-        <w:t xml:space="preserve">Câu #29 (1 Điểm)</w:t>
-      </w:r>
-    </w:p>
-    <w:p>
-      <w:pPr>
-        <w:spacing w:after="40"/>
-      </w:pPr>
-      <w:r>
-        <w:t xml:space="preserve">Bạn đang sử dụng phát triển hướng kiểm thử chấp nhận (acceptance test-driven development) và thiết kế các ca kiểm thử dựa trên câu chuyện người dùng (user story) sau đây:</w:t>
-      </w:r>
-    </w:p>
-    <w:p>
-      <w:pPr>
-        <w:spacing w:after="40"/>
-      </w:pPr>
-      <w:r>
-        <w:t xml:space="preserve">Là một người dùng Thường (Regular) hoặc Đặc biệt (Special), tôi muốn có thể sử dụng thẻ tầng điện tử của mình, để truy cập các tầng cụ thể.</w:t>
-      </w:r>
-    </w:p>
-    <w:p>
-      <w:pPr>
-        <w:spacing w:after="40"/>
-      </w:pPr>
-      <w:r>
-        <w:t xml:space="preserve">Tiêu chí chấp nhận:</w:t>
-      </w:r>
-    </w:p>
-    <w:p>
-      <w:pPr>
-        <w:spacing w:after="40"/>
-      </w:pPr>
-      <w:r>
-        <w:t xml:space="preserve">AC1: Người dùng Thường có quyền truy cập các tầng 1 đến 3</w:t>
-      </w:r>
-    </w:p>
-    <w:p>
-      <w:pPr>
-        <w:spacing w:after="40"/>
-      </w:pPr>
-      <w:r>
-        <w:t xml:space="preserve">AC2: Tầng 4 chỉ có thể được truy cập bởi người dùng Đặc biệt</w:t>
-      </w:r>
-    </w:p>
-    <w:p>
-      <w:pPr>
-        <w:spacing w:after="40"/>
-      </w:pPr>
-      <w:r>
-        <w:t xml:space="preserve">AC3: Người dùng Đặc biệt có tất cả các quyền truy cập của người dùng Thường</w:t>
-      </w:r>
-    </w:p>
-    <w:p>
-      <w:pPr>
-        <w:spacing w:after="40"/>
-      </w:pPr>
-      <w:r>
-        <w:t xml:space="preserve">Ca kiểm thử nào là hợp lý NHẤT để kiểm thử AC3?</w:t>
-      </w:r>
-    </w:p>
-    <w:p>
-      <w:pPr>
-        <w:spacing w:after="40"/>
-      </w:pPr>
-      <w:r>
-        <w:t xml:space="preserve">a) Kiểm tra rằng một người dùng Thường có thể truy cập các tầng 1 và 3</w:t>
-      </w:r>
-    </w:p>
-    <w:p>
-      <w:pPr>
-        <w:spacing w:after="40"/>
-      </w:pPr>
-      <w:r>
-        <w:t xml:space="preserve">b) Kiểm tra rằng một người dùng Thường không thể truy cập tầng 4</w:t>
-      </w:r>
-    </w:p>
-    <w:p>
-      <w:pPr>
-        <w:spacing w:after="40"/>
-      </w:pPr>
-      <w:r>
-        <w:t xml:space="preserve">c) Kiểm tra rằng một người dùng Đặc biệt có thể truy cập tầng 5</w:t>
-      </w:r>
-    </w:p>
-    <w:p>
-      <w:pPr>
-        <w:spacing w:after="40"/>
-      </w:pPr>
-      <w:r>
-        <w:t xml:space="preserve">d) Kiểm tra rằng một người dùng Đặc biệt có thể truy cập các tầng 1, 2 và 3</w:t>
-      </w:r>
-    </w:p>
-    <w:p>
-      <w:pPr>
-        <w:spacing w:after="40"/>
-      </w:pPr>
-      <w:r>
-        <w:t xml:space="preserve">Chọn MỘT phương án.</w:t>
-      </w:r>
-    </w:p>
-    <w:p>
-      <w:pPr>
-        <w:pStyle w:val="Heading2"/>
-        <w:spacing w:after="80" w:before="200"/>
-      </w:pPr>
-      <w:r>
-        <w:rPr>
-          <w:b/>
-          <w:bCs/>
-        </w:rPr>
-        <w:t xml:space="preserve">Câu #30 (1 Điểm)</w:t>
-      </w:r>
-    </w:p>
-    <w:p>
-      <w:pPr>
-        <w:spacing w:after="40"/>
-      </w:pPr>
-      <w:r>
-        <w:t xml:space="preserve">Điều nào sau đây KHÔNG phải là một mục đích của kế hoạch kiểm thử (test plan)?</w:t>
-      </w:r>
-    </w:p>
-    <w:p>
-      <w:pPr>
-        <w:spacing w:after="40"/>
-      </w:pPr>
-      <w:r>
-        <w:t xml:space="preserve">a) Định nghĩa dữ liệu kiểm thử và kết quả mong đợi cho kiểm thử thành phần và kiểm thử tích hợp thành phần</w:t>
-      </w:r>
-    </w:p>
-    <w:p>
-      <w:pPr>
-        <w:spacing w:after="40"/>
-      </w:pPr>
-      <w:r>
-        <w:t xml:space="preserve">b) Định nghĩa như một tiêu chí thoát (exit criteria) khỏi cấp độ kiểm thử thành phần rằng "phải đạt được 100% độ bao phủ câu lệnh và 100% độ bao phủ nhánh"</w:t>
-      </w:r>
-    </w:p>
-    <w:p>
-      <w:pPr>
-        <w:spacing w:after="40"/>
-      </w:pPr>
-      <w:r>
-        <w:t xml:space="preserve">c) Mô tả báo cáo tiến độ kiểm thử sẽ chứa những trường nào và hình thức của báo cáo này nên như thế nào</w:t>
-      </w:r>
-    </w:p>
-    <w:p>
-      <w:pPr>
-        <w:spacing w:after="40"/>
-      </w:pPr>
-      <w:r>
-        <w:t xml:space="preserve">d) Giải thích tại sao kiểm thử tích hợp hệ thống sẽ bị loại trừ khỏi việc kiểm thử, mặc dù chiến lược kiểm thử yêu cầu cấp độ kiểm thử này</w:t>
-      </w:r>
-    </w:p>
-    <w:p>
-      <w:pPr>
-        <w:spacing w:after="40"/>
-      </w:pPr>
-      <w:r>
-        <w:t xml:space="preserve">Chọn MỘT phương án.</w:t>
-      </w:r>
-    </w:p>
-    <w:p>
-      <w:pPr>
-        <w:pBdr>
-          <w:bottom w:val="single" w:color="AAAAAA" w:sz="6" w:space="1"/>
-        </w:pBdr>
-        <w:spacing w:after="120"/>
-      </w:pPr>
-    </w:p>
-    <w:p>
-      <w:pPr>
-        <w:spacing w:after="20"/>
-      </w:pPr>
-      <w:r>
-        <w:rPr>
-          <w:color w:val="888888"/>
-          <w:sz w:val="16"/>
-          <w:szCs w:val="16"/>
-        </w:rPr>
-        <w:t xml:space="preserve">Phiên bản 1.6 — Trang 18/21 — Ngày 25 tháng 3 năm 2025</w:t>
-      </w:r>
-    </w:p>
-    <w:p>
-      <w:pPr>
-        <w:spacing w:after="20"/>
-      </w:pPr>
-      <w:r>
-        <w:rPr>
-          <w:color w:val="888888"/>
-          <w:sz w:val="16"/>
-          <w:szCs w:val="16"/>
-        </w:rPr>
-        <w:t xml:space="preserve">© International Software Testing Qualifications Board</w:t>
-      </w:r>
-    </w:p>
-    <w:p>
-      <w:pPr>
-        <w:pStyle w:val="Heading2"/>
-        <w:spacing w:after="80" w:before="200"/>
-      </w:pPr>
-      <w:r>
-        <w:rPr>
-          <w:b/>
-          <w:bCs/>
-        </w:rPr>
-        <w:t xml:space="preserve">Câu #31 (1 Điểm)</w:t>
-      </w:r>
-    </w:p>
-    <w:p>
-      <w:pPr>
-        <w:spacing w:after="40"/>
-      </w:pPr>
-      <w:r>
-        <w:t xml:space="preserve">Vào đầu mỗi vòng lặp (iteration), nhóm ước lượng khối lượng công việc (tính bằng người-ngày) mà họ sẽ cần hoàn thành trong vòng lặp đó. Gọi E(n) là khối lượng công việc ước lượng cho vòng lặp n, và gọi A(n) là khối lượng công việc thực tế đã hoàn thành trong vòng lặp n. Từ vòng lặp thứ ba, nhóm sử dụng mô hình ước lượng sau dựa trên phép ngoại suy (extrapolation):</w:t>
-      </w:r>
-    </w:p>
-    <w:p>
-      <w:pPr>
-        <w:spacing w:after="40"/>
-      </w:pPr>
-      <w:r>
-        <w:t xml:space="preserve">E(n) = ( 3 * A(n-1) + A(n-2) ) / 4</w:t>
-      </w:r>
-    </w:p>
-    <w:p>
-      <w:pPr>
-        <w:spacing w:after="40"/>
-      </w:pPr>
-      <w:r>
-        <w:t xml:space="preserve">Biểu đồ cho thấy khối lượng công việc ước lượng và thực tế cho bốn vòng lặp đầu tiên.</w:t>
-      </w:r>
-    </w:p>
-    <w:p>
-      <w:pPr>
-        <w:shd w:fill="F2F2F2" w:val="clear"/>
-        <w:spacing w:after="40"/>
-        <w:ind w:left="360"/>
-      </w:pPr>
-      <w:r>
-        <w:rPr>
-          <w:i/>
-          <w:iCs/>
-          <w:color w:val="555555"/>
-          <w:sz w:val="20"/>
-          <w:szCs w:val="20"/>
-        </w:rPr>
-        <w:t xml:space="preserve">[HÌNH ẢNH: Biểu đồ cột — giữ nguyên hình ảnh gốc từ tài liệu.]</w:t>
-      </w:r>
-    </w:p>
-    <w:p>
-      <w:pPr>
-        <w:shd w:fill="F2F2F2" w:val="clear"/>
-        <w:spacing w:after="40"/>
-        <w:ind w:left="360"/>
-      </w:pPr>
-      <w:r>
-        <w:rPr>
-          <w:i/>
-          <w:iCs/>
-          <w:color w:val="555555"/>
-          <w:sz w:val="20"/>
-          <w:szCs w:val="20"/>
-        </w:rPr>
-        <w:t xml:space="preserve">Trục tung: 0–13. Tiêu đề: "Estimated and actual effort (in person-days)" (Nỗ lực ước lượng và thực tế (tính bằng người-ngày)).</w:t>
-      </w:r>
-    </w:p>
-    <w:p>
-      <w:pPr>
-        <w:shd w:fill="F2F2F2" w:val="clear"/>
-        <w:spacing w:after="40"/>
-        <w:ind w:left="360"/>
-      </w:pPr>
-      <w:r>
-        <w:rPr>
-          <w:i/>
-          <w:iCs/>
-          <w:color w:val="555555"/>
-          <w:sz w:val="20"/>
-          <w:szCs w:val="20"/>
-        </w:rPr>
-        <w:t xml:space="preserve">Trục hoành: Iteration #1 (Vòng lặp #1), Iteration #2 (Vòng lặp #2), Iteration #3 (Vòng lặp #3), Iteration #4 (Vòng lặp #4).</w:t>
-      </w:r>
-    </w:p>
-    <w:p>
-      <w:pPr>
-        <w:shd w:fill="F2F2F2" w:val="clear"/>
-        <w:spacing w:after="40"/>
-        <w:ind w:left="360"/>
-      </w:pPr>
-      <w:r>
-        <w:rPr>
-          <w:i/>
-          <w:iCs/>
-          <w:color w:val="555555"/>
-          <w:sz w:val="20"/>
-          <w:szCs w:val="20"/>
-        </w:rPr>
-        <w:t xml:space="preserve">Chú giải: Estimated (Ước lượng), Actual (Thực tế).</w:t>
-      </w:r>
-    </w:p>
-    <w:p>
-      <w:pPr>
-        <w:spacing w:after="40"/>
-      </w:pPr>
-      <w:r>
-        <w:t xml:space="preserve">Khối lượng công việc ước lượng cho vòng lặp #5 là bao nhiêu?</w:t>
-      </w:r>
-    </w:p>
-    <w:p>
-      <w:pPr>
-        <w:spacing w:after="40"/>
-      </w:pPr>
-      <w:r>
-        <w:t xml:space="preserve">a) 10,5 người-ngày</w:t>
-      </w:r>
-    </w:p>
-    <w:p>
-      <w:pPr>
-        <w:spacing w:after="40"/>
-      </w:pPr>
-      <w:r>
-        <w:t xml:space="preserve">b) 8,25 người-ngày</w:t>
-      </w:r>
-    </w:p>
-    <w:p>
-      <w:pPr>
-        <w:spacing w:after="40"/>
-      </w:pPr>
-      <w:r>
-        <w:t xml:space="preserve">c) 6,5 người-ngày</w:t>
-      </w:r>
-    </w:p>
-    <w:p>
-      <w:pPr>
-        <w:spacing w:after="40"/>
-      </w:pPr>
-      <w:r>
-        <w:t xml:space="preserve">d) 9,4 người-ngày</w:t>
-      </w:r>
-    </w:p>
-    <w:p>
-      <w:pPr>
-        <w:spacing w:after="40"/>
-      </w:pPr>
-      <w:r>
-        <w:t xml:space="preserve">Chọn MỘT phương án.</w:t>
-      </w:r>
-    </w:p>
-    <w:p>
-      <w:pPr>
-        <w:pBdr>
-          <w:bottom w:val="single" w:color="AAAAAA" w:sz="6" w:space="1"/>
-        </w:pBdr>
-        <w:spacing w:after="120"/>
-      </w:pPr>
-    </w:p>
-    <w:p>
-      <w:pPr>
-        <w:spacing w:after="20"/>
-      </w:pPr>
-      <w:r>
-        <w:rPr>
-          <w:color w:val="888888"/>
-          <w:sz w:val="16"/>
-          <w:szCs w:val="16"/>
-        </w:rPr>
-        <w:t xml:space="preserve">Phiên bản 1.6 — Trang 19/21 — Ngày 25 tháng 3 năm 2025</w:t>
-      </w:r>
-    </w:p>
-    <w:p>
-      <w:pPr>
-        <w:spacing w:after="20"/>
-      </w:pPr>
-      <w:r>
-        <w:rPr>
-          <w:color w:val="888888"/>
-          <w:sz w:val="16"/>
-          <w:szCs w:val="16"/>
-        </w:rPr>
-        <w:t xml:space="preserve">© International Software Testing Qualifications Board</w:t>
-      </w:r>
-    </w:p>
-    <w:p>
-      <w:pPr>
-        <w:pStyle w:val="Heading2"/>
-        <w:spacing w:after="80" w:before="200"/>
-      </w:pPr>
-      <w:r>
-        <w:rPr>
-          <w:b/>
-          <w:bCs/>
-        </w:rPr>
-        <w:t xml:space="preserve">Câu #32 (1 Điểm)</w:t>
-      </w:r>
-    </w:p>
-    <w:p>
-      <w:pPr>
-        <w:spacing w:after="40"/>
-      </w:pPr>
-      <w:r>
-        <w:t xml:space="preserve">Bạn đang chuẩn bị một lịch thực thi kiểm thử để thực thi bảy ca kiểm thử TC 1 đến TC 7.</w:t>
-      </w:r>
-    </w:p>
-    <w:p>
-      <w:pPr>
-        <w:spacing w:after="40"/>
-      </w:pPr>
-      <w:r>
-        <w:t xml:space="preserve">Hình sau đây bao gồm các mức độ ưu tiên của các ca kiểm thử này (1 = ưu tiên cao nhất, 3 = ưu tiên thấp nhất).</w:t>
-      </w:r>
-    </w:p>
-    <w:p>
-      <w:pPr>
-        <w:spacing w:after="40"/>
-      </w:pPr>
-      <w:r>
-        <w:t xml:space="preserve">Hình cũng cho thấy các phụ thuộc giữa các ca kiểm thử bằng các mũi tên. Ví dụ, mũi tên từ TC 4 đến TC 5 nghĩa là TC 5 chỉ có thể được thực thi nếu TC 4 đã được thực thi trước đó.</w:t>
-      </w:r>
-    </w:p>
-    <w:p>
-      <w:pPr>
-        <w:shd w:fill="F2F2F2" w:val="clear"/>
-        <w:spacing w:after="40"/>
-        <w:ind w:left="360"/>
-      </w:pPr>
-      <w:r>
-        <w:rPr>
-          <w:i/>
-          <w:iCs/>
-          <w:color w:val="555555"/>
-          <w:sz w:val="20"/>
-          <w:szCs w:val="20"/>
-        </w:rPr>
-        <w:t xml:space="preserve">[HÌNH ẢNH: Sơ đồ các ca kiểm thử với mức độ ưu tiên và các mũi tên phụ thuộc — giữ nguyên hình ảnh gốc từ tài liệu.]</w:t>
+          <w:color w:val="777777"/>
+          <w:sz w:val="18"/>
+          <w:szCs w:val="18"/>
+        </w:rPr>
+        <w:t xml:space="preserve">Sơ đồ các ca kiểm thử với mức độ ưu tiên và các mũi tên phụ thuộc</w:t>
       </w:r>
     </w:p>
     <w:p>

</xml_diff>